<commit_message>
Europe standard CV Added
</commit_message>
<xml_diff>
--- a/cv/Jewel-Rana-CV.docx
+++ b/cv/Jewel-Rana-CV.docx
@@ -1122,7 +1122,7 @@
       <w:pPr>
         <w:spacing w:after="60"/>
       </w:pPr>
-      <w:hyperlink w:history="1" r:id="rIdxr2c99sq_rfri3grh95pg">
+      <w:hyperlink w:history="1" r:id="rIdpfs-cwrguqt_59cnfh8iq">
         <w:r>
           <w:rPr>
             <w:rFonts w:ascii="Calibri" w:cs="Calibri" w:eastAsia="Calibri" w:hAnsi="Calibri"/>
@@ -1139,7 +1139,7 @@
       <w:pPr>
         <w:spacing w:after="60"/>
       </w:pPr>
-      <w:hyperlink w:history="1" r:id="rIdq-aork5dt8gyn4w1g_xqb">
+      <w:hyperlink w:history="1" r:id="rIdmqwu2d3jszdpw9rdgau26">
         <w:r>
           <w:rPr>
             <w:rFonts w:ascii="Calibri" w:cs="Calibri" w:eastAsia="Calibri" w:hAnsi="Calibri"/>
@@ -1736,7 +1736,7 @@
       <w:pPr>
         <w:spacing w:after="60"/>
       </w:pPr>
-      <w:hyperlink w:history="1" r:id="rIdpkjr8yobbptu40xglkeud">
+      <w:hyperlink w:history="1" r:id="rId1niji2mns3omh0e0mjxtm">
         <w:r>
           <w:rPr>
             <w:rFonts w:ascii="Calibri" w:cs="Calibri" w:eastAsia="Calibri" w:hAnsi="Calibri"/>
@@ -1940,7 +1940,7 @@
       <w:pPr>
         <w:spacing w:after="60"/>
       </w:pPr>
-      <w:hyperlink w:history="1" r:id="rIdzalfhihodbcqq5wq78stp">
+      <w:hyperlink w:history="1" r:id="rIdby-k6gwwfmzkznlfoigbq">
         <w:r>
           <w:rPr>
             <w:rFonts w:ascii="Calibri" w:cs="Calibri" w:eastAsia="Calibri" w:hAnsi="Calibri"/>
@@ -1995,7 +1995,7 @@
       <w:pPr>
         <w:spacing w:after="60"/>
       </w:pPr>
-      <w:hyperlink w:history="1" r:id="rIdb_j6gun83-wb8uq5l7w2u">
+      <w:hyperlink w:history="1" r:id="rId0x88owyzdbxxh5rna9lkz">
         <w:r>
           <w:rPr>
             <w:rFonts w:ascii="Calibri" w:cs="Calibri" w:eastAsia="Calibri" w:hAnsi="Calibri"/>
@@ -2030,7 +2030,7 @@
       <w:pPr>
         <w:spacing w:after="60"/>
       </w:pPr>
-      <w:hyperlink w:history="1" r:id="rIdkuctjoifx8ae0xqkxzu-t">
+      <w:hyperlink w:history="1" r:id="rId5edelrhmwgqxt_jnzynia">
         <w:r>
           <w:rPr>
             <w:rFonts w:ascii="Calibri" w:cs="Calibri" w:eastAsia="Calibri" w:hAnsi="Calibri"/>
@@ -2065,7 +2065,7 @@
       <w:pPr>
         <w:spacing w:after="60"/>
       </w:pPr>
-      <w:hyperlink w:history="1" r:id="rIdyqyv1oo55thyfc0wuhoba">
+      <w:hyperlink w:history="1" r:id="rId1wzmanyxewboohxnxsryc">
         <w:r>
           <w:rPr>
             <w:rFonts w:ascii="Calibri" w:cs="Calibri" w:eastAsia="Calibri" w:hAnsi="Calibri"/>
@@ -2100,7 +2100,7 @@
       <w:pPr>
         <w:spacing w:after="60"/>
       </w:pPr>
-      <w:hyperlink w:history="1" r:id="rIdclzxlyf7pycsmnzwub_ql">
+      <w:hyperlink w:history="1" r:id="rIdm0tdvm3kxokjtgwzvmpxq">
         <w:r>
           <w:rPr>
             <w:rFonts w:ascii="Calibri" w:cs="Calibri" w:eastAsia="Calibri" w:hAnsi="Calibri"/>
@@ -2135,7 +2135,7 @@
       <w:pPr>
         <w:spacing w:after="60"/>
       </w:pPr>
-      <w:hyperlink w:history="1" r:id="rId227k4rm2xvxxmsle9_jo0">
+      <w:hyperlink w:history="1" r:id="rIdey5mjxyhsaw-xikgtwltc">
         <w:r>
           <w:rPr>
             <w:rFonts w:ascii="Calibri" w:cs="Calibri" w:eastAsia="Calibri" w:hAnsi="Calibri"/>
@@ -2170,7 +2170,7 @@
       <w:pPr>
         <w:spacing w:after="60"/>
       </w:pPr>
-      <w:hyperlink w:history="1" r:id="rIdnud6evpnz3whweq04fdoi">
+      <w:hyperlink w:history="1" r:id="rIddjrfd5zri2n_bdmwwuh67">
         <w:r>
           <w:rPr>
             <w:rFonts w:ascii="Calibri" w:cs="Calibri" w:eastAsia="Calibri" w:hAnsi="Calibri"/>
@@ -2205,7 +2205,7 @@
       <w:pPr>
         <w:spacing w:after="60"/>
       </w:pPr>
-      <w:hyperlink w:history="1" r:id="rIdzir4ycv4sopxpa_rfsi7y">
+      <w:hyperlink w:history="1" r:id="rId91rbicntjzzoe11_6gi4h">
         <w:r>
           <w:rPr>
             <w:rFonts w:ascii="Calibri" w:cs="Calibri" w:eastAsia="Calibri" w:hAnsi="Calibri"/>
@@ -2240,7 +2240,7 @@
       <w:pPr>
         <w:spacing w:after="60"/>
       </w:pPr>
-      <w:hyperlink w:history="1" r:id="rIdk92tmbgu1psp9b9lj73yh">
+      <w:hyperlink w:history="1" r:id="rIdeame2_ckjrty6n6hmoln5">
         <w:r>
           <w:rPr>
             <w:rFonts w:ascii="Calibri" w:cs="Calibri" w:eastAsia="Calibri" w:hAnsi="Calibri"/>
@@ -2275,7 +2275,7 @@
       <w:pPr>
         <w:spacing w:after="60"/>
       </w:pPr>
-      <w:hyperlink w:history="1" r:id="rIdmr9irzhaf2dtenos8uymb">
+      <w:hyperlink w:history="1" r:id="rId7we_gedznrmb0fxdse9w9">
         <w:r>
           <w:rPr>
             <w:rFonts w:ascii="Calibri" w:cs="Calibri" w:eastAsia="Calibri" w:hAnsi="Calibri"/>

</xml_diff>